<commit_message>
Thesis: functionality tests allow a single-model benchmark
Co-Authored-By: Claude Opus 5.5 <noreply@anthropic.com>
Claude-Session: https://claude.ai/code/session_01THqB2neCikVAawL45RNVrt
</commit_message>
<xml_diff>
--- a/docs/thesis/testing/2 - AgentMeter Functionality Test Cases.docx
+++ b/docs/thesis/testing/2 - AgentMeter Functionality Test Cases.docx
@@ -1939,26 +1939,26 @@
                 <w:i w:val="0"/>
                 <w:sz w:val="24"/>
               </w:rPr>
-              <w:t>Select only one model</w:t>
-            </w:r>
-          </w:p>
-        </w:tc>
-        <w:tc>
-          <w:tcPr>
-            <w:tcW w:type="dxa" w:w="2360"/>
-          </w:tcPr>
-          <w:p>
-            <w:pPr>
-              <w:spacing w:after="0" w:line="264" w:lineRule="auto"/>
-            </w:pPr>
-            <w:r>
-              <w:rPr>
-                <w:rFonts w:ascii="Times New Roman" w:hAnsi="Times New Roman" w:eastAsia="Times New Roman"/>
-                <w:b w:val="0"/>
-                <w:i w:val="0"/>
-                <w:sz w:val="24"/>
-              </w:rPr>
-              <w:t>Wizard asks for at least two models before continuing</w:t>
+              <w:t>Select one model</w:t>
+            </w:r>
+          </w:p>
+        </w:tc>
+        <w:tc>
+          <w:tcPr>
+            <w:tcW w:type="dxa" w:w="2360"/>
+          </w:tcPr>
+          <w:p>
+            <w:pPr>
+              <w:spacing w:after="0" w:line="264" w:lineRule="auto"/>
+            </w:pPr>
+            <w:r>
+              <w:rPr>
+                <w:rFonts w:ascii="Times New Roman" w:hAnsi="Times New Roman" w:eastAsia="Times New Roman"/>
+                <w:b w:val="0"/>
+                <w:i w:val="0"/>
+                <w:sz w:val="24"/>
+              </w:rPr>
+              <w:t>Benchmark can run with a single model</w:t>
             </w:r>
           </w:p>
         </w:tc>
@@ -2035,26 +2035,26 @@
                 <w:i w:val="0"/>
                 <w:sz w:val="24"/>
               </w:rPr>
-              <w:t>Select five models</w:t>
-            </w:r>
-          </w:p>
-        </w:tc>
-        <w:tc>
-          <w:tcPr>
-            <w:tcW w:type="dxa" w:w="2360"/>
-          </w:tcPr>
-          <w:p>
-            <w:pPr>
-              <w:spacing w:after="0" w:line="264" w:lineRule="auto"/>
-            </w:pPr>
-            <w:r>
-              <w:rPr>
-                <w:rFonts w:ascii="Times New Roman" w:hAnsi="Times New Roman" w:eastAsia="Times New Roman"/>
-                <w:b w:val="0"/>
-                <w:i w:val="0"/>
-                <w:sz w:val="24"/>
-              </w:rPr>
-              <w:t>Wizard allows at most four models per session</w:t>
+              <w:t>Try to select a fifth model</w:t>
+            </w:r>
+          </w:p>
+        </w:tc>
+        <w:tc>
+          <w:tcPr>
+            <w:tcW w:type="dxa" w:w="2360"/>
+          </w:tcPr>
+          <w:p>
+            <w:pPr>
+              <w:spacing w:after="0" w:line="264" w:lineRule="auto"/>
+            </w:pPr>
+            <w:r>
+              <w:rPr>
+                <w:rFonts w:ascii="Times New Roman" w:hAnsi="Times New Roman" w:eastAsia="Times New Roman"/>
+                <w:b w:val="0"/>
+                <w:i w:val="0"/>
+                <w:sz w:val="24"/>
+              </w:rPr>
+              <w:t>Further models are greyed out once four are selected</w:t>
             </w:r>
           </w:p>
         </w:tc>

</xml_diff>

<commit_message>
Thesis: no mobile use in the functionality and UAT documents
Co-Authored-By: Claude Opus 5.5 <noreply@anthropic.com>
Claude-Session: https://claude.ai/code/session_01THqB2neCikVAawL45RNVrt
</commit_message>
<xml_diff>
--- a/docs/thesis/testing/2 - AgentMeter Functionality Test Cases.docx
+++ b/docs/thesis/testing/2 - AgentMeter Functionality Test Cases.docx
@@ -7911,102 +7911,6 @@
                 <w:sz w:val="24"/>
               </w:rPr>
               <w:t>Interface changes immediately and the choice is remembered</w:t>
-            </w:r>
-          </w:p>
-        </w:tc>
-        <w:tc>
-          <w:tcPr>
-            <w:tcW w:type="dxa" w:w="944"/>
-          </w:tcPr>
-          <w:p>
-            <w:pPr>
-              <w:spacing w:after="0" w:line="264" w:lineRule="auto"/>
-            </w:pPr>
-            <w:r>
-              <w:rPr>
-                <w:rFonts w:ascii="Times New Roman" w:hAnsi="Times New Roman" w:eastAsia="Times New Roman"/>
-                <w:b w:val="0"/>
-                <w:i w:val="0"/>
-                <w:sz w:val="24"/>
-              </w:rPr>
-            </w:r>
-          </w:p>
-        </w:tc>
-      </w:tr>
-      <w:tr>
-        <w:tc>
-          <w:tcPr>
-            <w:tcW w:type="dxa" w:w="944"/>
-          </w:tcPr>
-          <w:p>
-            <w:pPr>
-              <w:spacing w:after="0" w:line="264" w:lineRule="auto"/>
-            </w:pPr>
-            <w:r>
-              <w:rPr>
-                <w:rFonts w:ascii="Times New Roman" w:hAnsi="Times New Roman" w:eastAsia="Times New Roman"/>
-                <w:b w:val="0"/>
-                <w:i w:val="0"/>
-                <w:sz w:val="24"/>
-              </w:rPr>
-              <w:t>FT-82</w:t>
-            </w:r>
-          </w:p>
-        </w:tc>
-        <w:tc>
-          <w:tcPr>
-            <w:tcW w:type="dxa" w:w="1699"/>
-          </w:tcPr>
-          <w:p>
-            <w:pPr>
-              <w:spacing w:after="0" w:line="264" w:lineRule="auto"/>
-            </w:pPr>
-            <w:r>
-              <w:rPr>
-                <w:rFonts w:ascii="Times New Roman" w:hAnsi="Times New Roman" w:eastAsia="Times New Roman"/>
-                <w:b w:val="0"/>
-                <w:i w:val="0"/>
-                <w:sz w:val="24"/>
-              </w:rPr>
-              <w:t>General</w:t>
-            </w:r>
-          </w:p>
-        </w:tc>
-        <w:tc>
-          <w:tcPr>
-            <w:tcW w:type="dxa" w:w="2360"/>
-          </w:tcPr>
-          <w:p>
-            <w:pPr>
-              <w:spacing w:after="0" w:line="264" w:lineRule="auto"/>
-            </w:pPr>
-            <w:r>
-              <w:rPr>
-                <w:rFonts w:ascii="Times New Roman" w:hAnsi="Times New Roman" w:eastAsia="Times New Roman"/>
-                <w:b w:val="0"/>
-                <w:i w:val="0"/>
-                <w:sz w:val="24"/>
-              </w:rPr>
-              <w:t>Use the system on a phone</w:t>
-            </w:r>
-          </w:p>
-        </w:tc>
-        <w:tc>
-          <w:tcPr>
-            <w:tcW w:type="dxa" w:w="2360"/>
-          </w:tcPr>
-          <w:p>
-            <w:pPr>
-              <w:spacing w:after="0" w:line="264" w:lineRule="auto"/>
-            </w:pPr>
-            <w:r>
-              <w:rPr>
-                <w:rFonts w:ascii="Times New Roman" w:hAnsi="Times New Roman" w:eastAsia="Times New Roman"/>
-                <w:b w:val="0"/>
-                <w:i w:val="0"/>
-                <w:sz w:val="24"/>
-              </w:rPr>
-              <w:t>Pages fit the screen and every page can be reached</w:t>
             </w:r>
           </w:p>
         </w:tc>

</xml_diff>